<commit_message>
docs: adiciona requisitos de autenticacao e gestao de cardapio
Adiciona RF15-RF22, RN06-RN07 e US14-US21, cobrindo login,
segundo fator (TOTP, restrito a Gerente/Coordenador), gerenciamento
de contas de usuario e CRUD de itens do cardapio (cadastro, preco,
disponibilidade, promocao).

Atualiza a Matriz de Rastreabilidade com os novos RF/RN e amplia os
KPIs de BI para faturamento por item, categoria, hora e dia.
</commit_message>
<xml_diff>
--- a/docs/requisitos/GASTRA_KPIs_Criterios_Analiticos.docx
+++ b/docs/requisitos/GASTRA_KPIs_Criterios_Analiticos.docx
@@ -528,6 +528,63 @@
       </w:pPr>
       <w:r>
         <w:t>Índice composto de desempenho: combina faturamento + nº de mesas atendidas.</w:t>
+      </w:r>
+    </w:p>
+    <w:p>
+      <w:pPr>
+        <w:numPr>
+          <w:ilvl w:val="0"/>
+          <w:numId w:val="1"/>
+        </w:numPr>
+        <w:spacing w:after="80"/>
+      </w:pPr>
+      <w:r>
+        <w:t>Faturamento por item do cardápio, por período</w:t>
+      </w:r>
+      <w:r>
+        <w:t>.</w:t>
+      </w:r>
+    </w:p>
+    <w:p>
+      <w:pPr>
+        <w:numPr>
+          <w:ilvl w:val="0"/>
+          <w:numId w:val="1"/>
+        </w:numPr>
+        <w:spacing w:after="80"/>
+      </w:pPr>
+      <w:r>
+        <w:t>Faturamento por categoria (entrada, prato principal, sobremesa, bebida), por período.</w:t>
+      </w:r>
+    </w:p>
+    <w:p>
+      <w:pPr>
+        <w:numPr>
+          <w:ilvl w:val="0"/>
+          <w:numId w:val="1"/>
+        </w:numPr>
+        <w:spacing w:after="80"/>
+      </w:pPr>
+      <w:r>
+        <w:t>F</w:t>
+      </w:r>
+      <w:r>
+        <w:t>aturamento por praça, por hora do dia.</w:t>
+      </w:r>
+    </w:p>
+    <w:p>
+      <w:pPr>
+        <w:numPr>
+          <w:ilvl w:val="0"/>
+          <w:numId w:val="1"/>
+        </w:numPr>
+        <w:spacing w:after="80"/>
+      </w:pPr>
+      <w:r>
+        <w:t>Faturamento por praça, por dia da semana</w:t>
+      </w:r>
+      <w:r>
+        <w:t>.</w:t>
       </w:r>
     </w:p>
     <w:p>
@@ -1315,7 +1372,6 @@
   <w:style w:type="character" w:default="1" w:styleId="Fontepargpadro">
     <w:name w:val="Default Paragraph Font"/>
     <w:uiPriority w:val="1"/>
-    <w:semiHidden/>
     <w:unhideWhenUsed/>
   </w:style>
   <w:style w:type="table" w:default="1" w:styleId="Tabelanormal">

</xml_diff>